<commit_message>
Record verified v1.1.0 release evidence
</commit_message>
<xml_diff>
--- a/QBR-uni-main/qbr-dashboard/docs/portfolio/QBR-Dashboard-Portfolio.docx
+++ b/QBR-uni-main/qbr-dashboard/docs/portfolio/QBR-Dashboard-Portfolio.docx
@@ -115,7 +115,7 @@
                 <w:sz w:val="20"/>
                 <w:szCs w:val="20"/>
               </w:rPr>
-              <w:t xml:space="preserve">Narration: 1,985 words</w:t>
+              <w:t xml:space="preserve">Narration: 1,992 words</w:t>
             </w:r>
           </w:p>
           <w:p>
@@ -3860,7 +3860,7 @@
                 <w:sz w:val="24"/>
                 <w:szCs w:val="24"/>
               </w:rPr>
-              <w:t xml:space="preserve">Figure 6 and invalid fixture</w:t>
+              <w:t xml:space="preserve">Figure 7 and invalid fixture</w:t>
             </w:r>
           </w:p>
         </w:tc>
@@ -4305,7 +4305,7 @@
                 <w:sz w:val="24"/>
                 <w:szCs w:val="24"/>
               </w:rPr>
-              <w:t xml:space="preserve">Chart tests and Figure 8</w:t>
+              <w:t xml:space="preserve">Chart tests and Figure 9</w:t>
             </w:r>
           </w:p>
         </w:tc>
@@ -8312,7 +8312,7 @@
                 <w:sz w:val="24"/>
                 <w:szCs w:val="24"/>
               </w:rPr>
-              <w:t xml:space="preserve">Figure 6 and semantic tables</w:t>
+              <w:t xml:space="preserve">Figure 9 and semantic tables</w:t>
             </w:r>
           </w:p>
         </w:tc>
@@ -10512,7 +10512,7 @@
                 <w:sz w:val="24"/>
                 <w:szCs w:val="24"/>
               </w:rPr>
-              <w:t xml:space="preserve">GitHub Actions workflow</w:t>
+              <w:t xml:space="preserve">Final release commit</w:t>
             </w:r>
           </w:p>
         </w:tc>
@@ -10536,12 +10536,32 @@
             </w:pPr>
             <w:r>
               <w:rPr>
-                <w:rFonts w:ascii="Calibri" w:cs="Calibri" w:eastAsia="Calibri" w:hAnsi="Calibri"/>
-                <w:color w:val="132238"/>
-                <w:sz w:val="24"/>
-                <w:szCs w:val="24"/>
-              </w:rPr>
-              <w:t xml:space="preserve">Runs the Node regression suite on pushes and pull requests</w:t>
+                <w:rFonts w:ascii="Consolas" w:cs="Consolas" w:eastAsia="Consolas" w:hAnsi="Consolas"/>
+                <w:color w:val="8B1D3B"/>
+                <w:sz w:val="22"/>
+                <w:szCs w:val="22"/>
+                <w:shd w:fill="EDF2F7" w:val="clear"/>
+              </w:rPr>
+              <w:t xml:space="preserve">df32727b765e5bea64f972e0ca83244672ea502c</w:t>
+            </w:r>
+            <w:r>
+              <w:rPr>
+                <w:rFonts w:ascii="Calibri" w:cs="Calibri" w:eastAsia="Calibri" w:hAnsi="Calibri"/>
+                <w:color w:val="132238"/>
+                <w:sz w:val="24"/>
+                <w:szCs w:val="24"/>
+              </w:rPr>
+              <w:t xml:space="preserve"> on </w:t>
+            </w:r>
+            <w:r>
+              <w:rPr>
+                <w:rFonts w:ascii="Consolas" w:cs="Consolas" w:eastAsia="Consolas" w:hAnsi="Consolas"/>
+                <w:color w:val="8B1D3B"/>
+                <w:sz w:val="22"/>
+                <w:szCs w:val="22"/>
+                <w:shd w:fill="EDF2F7" w:val="clear"/>
+              </w:rPr>
+              <w:t xml:space="preserve">main</w:t>
             </w:r>
           </w:p>
         </w:tc>
@@ -10570,7 +10590,7 @@
                 <w:sz w:val="24"/>
                 <w:szCs w:val="24"/>
               </w:rPr>
-              <w:t xml:space="preserve">Provides a repeatable gate, but the final working-tree changes must be committed and the remote run checked</w:t>
+              <w:t xml:space="preserve">Records the application, portfolio and automated release publication state</w:t>
             </w:r>
           </w:p>
         </w:tc>
@@ -10603,7 +10623,7 @@
                 <w:sz w:val="24"/>
                 <w:szCs w:val="24"/>
               </w:rPr>
-              <w:t xml:space="preserve">Package version</w:t>
+              <w:t xml:space="preserve">GitHub Actions workflow</w:t>
             </w:r>
           </w:p>
         </w:tc>
@@ -10626,12 +10646,22 @@
             </w:pPr>
             <w:r>
               <w:rPr>
-                <w:rFonts w:ascii="Calibri" w:cs="Calibri" w:eastAsia="Calibri" w:hAnsi="Calibri"/>
-                <w:color w:val="132238"/>
-                <w:sz w:val="24"/>
-                <w:szCs w:val="24"/>
-              </w:rPr>
-              <w:t xml:space="preserve">Version 1.1.0</w:t>
+                <w:rFonts w:ascii="Consolas" w:cs="Consolas" w:eastAsia="Consolas" w:hAnsi="Consolas"/>
+                <w:color w:val="8B1D3B"/>
+                <w:sz w:val="22"/>
+                <w:szCs w:val="22"/>
+                <w:shd w:fill="EDF2F7" w:val="clear"/>
+              </w:rPr>
+              <w:t xml:space="preserve">QBR Dashboard Tests</w:t>
+            </w:r>
+            <w:r>
+              <w:rPr>
+                <w:rFonts w:ascii="Calibri" w:cs="Calibri" w:eastAsia="Calibri" w:hAnsi="Calibri"/>
+                <w:color w:val="132238"/>
+                <w:sz w:val="24"/>
+                <w:szCs w:val="24"/>
+              </w:rPr>
+              <w:t xml:space="preserve">, run 3, completed successfully on 19 August 2026</w:t>
             </w:r>
           </w:p>
         </w:tc>
@@ -10659,7 +10689,156 @@
                 <w:sz w:val="24"/>
                 <w:szCs w:val="24"/>
               </w:rPr>
-              <w:t xml:space="preserve">Identifies the application snapshot; a release tag and changelog would improve traceability</w:t>
+              <w:t xml:space="preserve">The remote </w:t>
+            </w:r>
+            <w:r>
+              <w:rPr>
+                <w:rFonts w:ascii="Consolas" w:cs="Consolas" w:eastAsia="Consolas" w:hAnsi="Consolas"/>
+                <w:color w:val="8B1D3B"/>
+                <w:sz w:val="22"/>
+                <w:szCs w:val="22"/>
+                <w:shd w:fill="EDF2F7" w:val="clear"/>
+              </w:rPr>
+              <w:t xml:space="preserve">Run regression tests</w:t>
+            </w:r>
+            <w:r>
+              <w:rPr>
+                <w:rFonts w:ascii="Calibri" w:cs="Calibri" w:eastAsia="Calibri" w:hAnsi="Calibri"/>
+                <w:color w:val="132238"/>
+                <w:sz w:val="24"/>
+                <w:szCs w:val="24"/>
+              </w:rPr>
+              <w:t xml:space="preserve"> step passed for the final release commit; the local suite reported 20/20</w:t>
+            </w:r>
+          </w:p>
+        </w:tc>
+      </w:tr>
+      <w:tr>
+        <w:trPr>
+          <w:cantSplit/>
+        </w:trPr>
+        <w:tc>
+          <w:tcPr>
+            <w:tcW w:type="dxa" w:w="2450"/>
+            <w:shd w:fill="F4F7FA" w:color="auto" w:val="clear"/>
+            <w:tcMar>
+              <w:top w:type="dxa" w:w="80"/>
+              <w:left w:type="dxa" w:w="90"/>
+              <w:bottom w:type="dxa" w:w="80"/>
+              <w:right w:type="dxa" w:w="90"/>
+            </w:tcMar>
+            <w:vAlign w:val="top"/>
+          </w:tcPr>
+          <w:p>
+            <w:pPr>
+              <w:keepLines/>
+              <w:spacing w:before="0" w:after="0" w:line="280" w:lineRule="auto"/>
+              <w:jc w:val="left"/>
+            </w:pPr>
+            <w:r>
+              <w:rPr>
+                <w:rFonts w:ascii="Calibri" w:cs="Calibri" w:eastAsia="Calibri" w:hAnsi="Calibri"/>
+                <w:color w:val="132238"/>
+                <w:sz w:val="24"/>
+                <w:szCs w:val="24"/>
+              </w:rPr>
+              <w:t xml:space="preserve">Release evidence</w:t>
+            </w:r>
+          </w:p>
+        </w:tc>
+        <w:tc>
+          <w:tcPr>
+            <w:tcW w:type="dxa" w:w="3474"/>
+            <w:shd w:fill="F4F7FA" w:color="auto" w:val="clear"/>
+            <w:tcMar>
+              <w:top w:type="dxa" w:w="80"/>
+              <w:left w:type="dxa" w:w="90"/>
+              <w:bottom w:type="dxa" w:w="80"/>
+              <w:right w:type="dxa" w:w="90"/>
+            </w:tcMar>
+            <w:vAlign w:val="top"/>
+          </w:tcPr>
+          <w:p>
+            <w:pPr>
+              <w:keepLines/>
+              <w:spacing w:before="0" w:after="0" w:line="280" w:lineRule="auto"/>
+              <w:jc w:val="left"/>
+            </w:pPr>
+            <w:r>
+              <w:rPr>
+                <w:rFonts w:ascii="Calibri" w:cs="Calibri" w:eastAsia="Calibri" w:hAnsi="Calibri"/>
+                <w:color w:val="132238"/>
+                <w:sz w:val="24"/>
+                <w:szCs w:val="24"/>
+              </w:rPr>
+              <w:t xml:space="preserve">Annotated tag </w:t>
+            </w:r>
+            <w:r>
+              <w:rPr>
+                <w:rFonts w:ascii="Consolas" w:cs="Consolas" w:eastAsia="Consolas" w:hAnsi="Consolas"/>
+                <w:color w:val="8B1D3B"/>
+                <w:sz w:val="22"/>
+                <w:szCs w:val="22"/>
+                <w:shd w:fill="EDF2F7" w:val="clear"/>
+              </w:rPr>
+              <w:t xml:space="preserve">v1.1.0</w:t>
+            </w:r>
+            <w:r>
+              <w:rPr>
+                <w:rFonts w:ascii="Calibri" w:cs="Calibri" w:eastAsia="Calibri" w:hAnsi="Calibri"/>
+                <w:color w:val="132238"/>
+                <w:sz w:val="24"/>
+                <w:szCs w:val="24"/>
+              </w:rPr>
+              <w:t xml:space="preserve">, </w:t>
+            </w:r>
+            <w:r>
+              <w:rPr>
+                <w:rFonts w:ascii="Consolas" w:cs="Consolas" w:eastAsia="Consolas" w:hAnsi="Consolas"/>
+                <w:color w:val="8B1D3B"/>
+                <w:sz w:val="22"/>
+                <w:szCs w:val="22"/>
+                <w:shd w:fill="EDF2F7" w:val="clear"/>
+              </w:rPr>
+              <w:t xml:space="preserve">CHANGELOG.md</w:t>
+            </w:r>
+            <w:r>
+              <w:rPr>
+                <w:rFonts w:ascii="Calibri" w:cs="Calibri" w:eastAsia="Calibri" w:hAnsi="Calibri"/>
+                <w:color w:val="132238"/>
+                <w:sz w:val="24"/>
+                <w:szCs w:val="24"/>
+              </w:rPr>
+              <w:t xml:space="preserve"> and GitHub Release published with Word and PDF assets</w:t>
+            </w:r>
+          </w:p>
+        </w:tc>
+        <w:tc>
+          <w:tcPr>
+            <w:tcW w:type="dxa" w:w="3474"/>
+            <w:shd w:fill="F4F7FA" w:color="auto" w:val="clear"/>
+            <w:tcMar>
+              <w:top w:type="dxa" w:w="80"/>
+              <w:left w:type="dxa" w:w="90"/>
+              <w:bottom w:type="dxa" w:w="80"/>
+              <w:right w:type="dxa" w:w="90"/>
+            </w:tcMar>
+            <w:vAlign w:val="top"/>
+          </w:tcPr>
+          <w:p>
+            <w:pPr>
+              <w:keepLines/>
+              <w:spacing w:before="0" w:after="0" w:line="280" w:lineRule="auto"/>
+              <w:jc w:val="left"/>
+            </w:pPr>
+            <w:r>
+              <w:rPr>
+                <w:rFonts w:ascii="Calibri" w:cs="Calibri" w:eastAsia="Calibri" w:hAnsi="Calibri"/>
+                <w:color w:val="132238"/>
+                <w:sz w:val="24"/>
+                <w:szCs w:val="24"/>
+              </w:rPr>
+              <w:t xml:space="preserve">Improves traceability, but the historical commit sequence remains less granular than an ideal requirement-linked history</w:t>
             </w:r>
           </w:p>
         </w:tc>
@@ -10669,6 +10848,71 @@
       <w:pPr>
         <w:spacing w:after="120"/>
       </w:pPr>
+    </w:p>
+    <w:p>
+      <w:pPr>
+        <w:keepNext/>
+        <w:spacing w:before="160" w:after="80"/>
+        <w:jc w:val="center"/>
+      </w:pPr>
+      <w:r>
+        <w:drawing>
+          <wp:inline distT="0" distB="0" distL="0" distR="0">
+            <wp:extent cx="5810250" cy="4210050"/>
+            <wp:effectExtent t="0" r="0" b="0" l="0"/>
+            <wp:docPr id="1" name="Successful GitHub Actions run for the final release commit" descr="Successful GitHub Actions run for the final release commit" title="Successful GitHub Actions run for the final release commit"/>
+            <wp:cNvGraphicFramePr>
+              <a:graphicFrameLocks xmlns:a="http://schemas.openxmlformats.org/drawingml/2006/main" noChangeAspect="1"/>
+            </wp:cNvGraphicFramePr>
+            <a:graphic xmlns:a="http://schemas.openxmlformats.org/drawingml/2006/main">
+              <a:graphicData uri="http://schemas.openxmlformats.org/drawingml/2006/picture">
+                <pic:pic xmlns:pic="http://schemas.openxmlformats.org/drawingml/2006/picture">
+                  <pic:nvPicPr>
+                    <pic:cNvPr id="0" name="" descr=""/>
+                    <pic:cNvPicPr>
+                      <a:picLocks noChangeAspect="1" noChangeArrowheads="1"/>
+                    </pic:cNvPicPr>
+                  </pic:nvPicPr>
+                  <pic:blipFill>
+                    <a:blip r:embed="rId15" cstate="none"/>
+                    <a:srcRect/>
+                    <a:stretch>
+                      <a:fillRect/>
+                    </a:stretch>
+                  </pic:blipFill>
+                  <pic:spPr bwMode="auto">
+                    <a:xfrm>
+                      <a:off x="0" y="0"/>
+                      <a:ext cx="5810250" cy="4210050"/>
+                    </a:xfrm>
+                    <a:prstGeom prst="rect">
+                      <a:avLst/>
+                    </a:prstGeom>
+                  </pic:spPr>
+                </pic:pic>
+              </a:graphicData>
+            </a:graphic>
+          </wp:inline>
+        </w:drawing>
+      </w:r>
+    </w:p>
+    <w:p>
+      <w:pPr>
+        <w:keepLines/>
+        <w:spacing w:after="220" w:line="280" w:lineRule="auto"/>
+        <w:jc w:val="center"/>
+      </w:pPr>
+      <w:r>
+        <w:rPr>
+          <w:rFonts w:ascii="Calibri" w:cs="Calibri" w:eastAsia="Calibri" w:hAnsi="Calibri"/>
+          <w:i/>
+          <w:iCs/>
+          <w:color w:val="52657A"/>
+          <w:sz w:val="24"/>
+          <w:szCs w:val="24"/>
+        </w:rPr>
+        <w:t xml:space="preserve">Figure 5. GitHub Actions run 3 completed successfully for commit df32727 on main. The test job passed remotely before the v1.1.0 release was published.</w:t>
+      </w:r>
     </w:p>
     <w:p>
       <w:pPr>
@@ -12134,7 +12378,7 @@
                     </pic:cNvPicPr>
                   </pic:nvPicPr>
                   <pic:blipFill>
-                    <a:blip r:embed="rId15" cstate="none"/>
+                    <a:blip r:embed="rId16" cstate="none"/>
                     <a:srcRect/>
                     <a:stretch>
                       <a:fillRect/>
@@ -12171,7 +12415,7 @@
           <w:sz w:val="24"/>
           <w:szCs w:val="24"/>
         </w:rPr>
-        <w:t xml:space="preserve">Figure 5. Automated regression evidence: 20 tests passed with zero failures or skips.</w:t>
+        <w:t xml:space="preserve">Figure 6. Automated regression evidence: 20 tests passed with zero failures or skips.</w:t>
       </w:r>
     </w:p>
     <w:p>
@@ -12199,7 +12443,7 @@
                     </pic:cNvPicPr>
                   </pic:nvPicPr>
                   <pic:blipFill>
-                    <a:blip r:embed="rId16" cstate="none"/>
+                    <a:blip r:embed="rId17" cstate="none"/>
                     <a:srcRect/>
                     <a:stretch>
                       <a:fillRect/>
@@ -12236,7 +12480,7 @@
           <w:sz w:val="24"/>
           <w:szCs w:val="24"/>
         </w:rPr>
-        <w:t xml:space="preserve">Figure 6. Negative testing: invalid date, value, target and direction data was rejected before persistence.</w:t>
+        <w:t xml:space="preserve">Figure 7. Negative testing: invalid date, value, target and direction data was rejected before persistence.</w:t>
       </w:r>
     </w:p>
     <w:p>
@@ -12264,7 +12508,7 @@
                     </pic:cNvPicPr>
                   </pic:nvPicPr>
                   <pic:blipFill>
-                    <a:blip r:embed="rId17" cstate="none"/>
+                    <a:blip r:embed="rId18" cstate="none"/>
                     <a:srcRect/>
                     <a:stretch>
                       <a:fillRect/>
@@ -12301,7 +12545,7 @@
           <w:sz w:val="24"/>
           <w:szCs w:val="24"/>
         </w:rPr>
-        <w:t xml:space="preserve">Figure 7. Boundary testing: zero meets a zero lower target, while a positive value against it is red.</w:t>
+        <w:t xml:space="preserve">Figure 8. Boundary testing: zero meets a zero lower target, while a positive value against it is red.</w:t>
       </w:r>
     </w:p>
     <w:p>
@@ -12329,7 +12573,7 @@
                     </pic:cNvPicPr>
                   </pic:nvPicPr>
                   <pic:blipFill>
-                    <a:blip r:embed="rId18" cstate="none"/>
+                    <a:blip r:embed="rId19" cstate="none"/>
                     <a:srcRect/>
                     <a:stretch>
                       <a:fillRect/>
@@ -12366,7 +12610,7 @@
           <w:sz w:val="24"/>
           <w:szCs w:val="24"/>
         </w:rPr>
-        <w:t xml:space="preserve">Figure 8. Unlike metrics remain separate and the chart has an expandable semantic data alternative.</w:t>
+        <w:t xml:space="preserve">Figure 9. Unlike metrics remain separate and the chart has an expandable semantic data alternative.</w:t>
       </w:r>
     </w:p>
     <w:p>
@@ -12394,7 +12638,7 @@
                     </pic:cNvPicPr>
                   </pic:nvPicPr>
                   <pic:blipFill>
-                    <a:blip r:embed="rId19" cstate="none"/>
+                    <a:blip r:embed="rId20" cstate="none"/>
                     <a:srcRect/>
                     <a:stretch>
                       <a:fillRect/>
@@ -12431,7 +12675,7 @@
           <w:sz w:val="24"/>
           <w:szCs w:val="24"/>
         </w:rPr>
-        <w:t xml:space="preserve">Figure 9. Searching the 48-row fixture for March returned the expected eight detailed records.</w:t>
+        <w:t xml:space="preserve">Figure 10. Searching the 48-row fixture for March returned the expected eight detailed records.</w:t>
       </w:r>
     </w:p>
     <w:p>
@@ -12459,7 +12703,7 @@
                     </pic:cNvPicPr>
                   </pic:nvPicPr>
                   <pic:blipFill>
-                    <a:blip r:embed="rId20" cstate="none"/>
+                    <a:blip r:embed="rId21" cstate="none"/>
                     <a:srcRect/>
                     <a:stretch>
                       <a:fillRect/>
@@ -12496,7 +12740,7 @@
           <w:sz w:val="24"/>
           <w:szCs w:val="24"/>
         </w:rPr>
-        <w:t xml:space="preserve">Figure 10. Three-engine workflow results, corrected contrast defects and five-run performance medians.</w:t>
+        <w:t xml:space="preserve">Figure 11. Three-engine workflow results, corrected contrast defects and five-run performance medians.</w:t>
       </w:r>
     </w:p>
     <w:p>
@@ -12561,7 +12805,45 @@
           <w:sz w:val="24"/>
           <w:szCs w:val="24"/>
         </w:rPr>
-        <w:t xml:space="preserve">This approach scales operationally only to the storage, processing power and browser profile of one device. Increasing row volume can be measured, but increasing users creates isolated copies rather than a shared service. A hosted architecture would be required for authentication, central backup, audit history and concurrent use. Maintenance currently involves dependency review, regression execution, browser checks and clear release notes. The existing GitHub Actions workflow supports repeatable regression testing once final changes are committed and pushed.</w:t>
+        <w:t xml:space="preserve">This approach scales operationally only to the storage, processing power and browser profile of one device. Increasing row volume can be measured, but increasing users creates isolated copies rather than a shared service. A hosted architecture would be required for authentication, central backup, audit history and concurrent use. Maintenance currently involves dependency review, regression execution, browser checks and clear release notes. The final </w:t>
+      </w:r>
+      <w:r>
+        <w:rPr>
+          <w:rFonts w:ascii="Consolas" w:cs="Consolas" w:eastAsia="Consolas" w:hAnsi="Consolas"/>
+          <w:color w:val="8B1D3B"/>
+          <w:sz w:val="22"/>
+          <w:szCs w:val="22"/>
+          <w:shd w:fill="EDF2F7" w:val="clear"/>
+        </w:rPr>
+        <w:t xml:space="preserve">main</w:t>
+      </w:r>
+      <w:r>
+        <w:rPr>
+          <w:rFonts w:ascii="Calibri" w:cs="Calibri" w:eastAsia="Calibri" w:hAnsi="Calibri"/>
+          <w:color w:val="132238"/>
+          <w:sz w:val="24"/>
+          <w:szCs w:val="24"/>
+        </w:rPr>
+        <w:t xml:space="preserve"> commit passed the remote GitHub Actions regression workflow before the annotated </w:t>
+      </w:r>
+      <w:r>
+        <w:rPr>
+          <w:rFonts w:ascii="Consolas" w:cs="Consolas" w:eastAsia="Consolas" w:hAnsi="Consolas"/>
+          <w:color w:val="8B1D3B"/>
+          <w:sz w:val="22"/>
+          <w:szCs w:val="22"/>
+          <w:shd w:fill="EDF2F7" w:val="clear"/>
+        </w:rPr>
+        <w:t xml:space="preserve">v1.1.0</w:t>
+      </w:r>
+      <w:r>
+        <w:rPr>
+          <w:rFonts w:ascii="Calibri" w:cs="Calibri" w:eastAsia="Calibri" w:hAnsi="Calibri"/>
+          <w:color w:val="132238"/>
+          <w:sz w:val="24"/>
+          <w:szCs w:val="24"/>
+        </w:rPr>
+        <w:t xml:space="preserve"> tag and GitHub Release were published.</w:t>
       </w:r>
     </w:p>
     <w:p>
@@ -13319,7 +13601,64 @@
                 <w:sz w:val="24"/>
                 <w:szCs w:val="24"/>
               </w:rPr>
-              <w:t xml:space="preserve">Node tests and GitHub Actions workflow</w:t>
+              <w:t xml:space="preserve">Final </w:t>
+            </w:r>
+            <w:r>
+              <w:rPr>
+                <w:rFonts w:ascii="Consolas" w:cs="Consolas" w:eastAsia="Consolas" w:hAnsi="Consolas"/>
+                <w:color w:val="8B1D3B"/>
+                <w:sz w:val="22"/>
+                <w:szCs w:val="22"/>
+                <w:shd w:fill="EDF2F7" w:val="clear"/>
+              </w:rPr>
+              <w:t xml:space="preserve">main</w:t>
+            </w:r>
+            <w:r>
+              <w:rPr>
+                <w:rFonts w:ascii="Calibri" w:cs="Calibri" w:eastAsia="Calibri" w:hAnsi="Calibri"/>
+                <w:color w:val="132238"/>
+                <w:sz w:val="24"/>
+                <w:szCs w:val="24"/>
+              </w:rPr>
+              <w:t xml:space="preserve"> commit </w:t>
+            </w:r>
+            <w:r>
+              <w:rPr>
+                <w:rFonts w:ascii="Consolas" w:cs="Consolas" w:eastAsia="Consolas" w:hAnsi="Consolas"/>
+                <w:color w:val="8B1D3B"/>
+                <w:sz w:val="22"/>
+                <w:szCs w:val="22"/>
+                <w:shd w:fill="EDF2F7" w:val="clear"/>
+              </w:rPr>
+              <w:t xml:space="preserve">df32727</w:t>
+            </w:r>
+            <w:r>
+              <w:rPr>
+                <w:rFonts w:ascii="Calibri" w:cs="Calibri" w:eastAsia="Calibri" w:hAnsi="Calibri"/>
+                <w:color w:val="132238"/>
+                <w:sz w:val="24"/>
+                <w:szCs w:val="24"/>
+              </w:rPr>
+              <w:t xml:space="preserve">; local 20/20 tests; successful remote workflow run 3; annotated </w:t>
+            </w:r>
+            <w:r>
+              <w:rPr>
+                <w:rFonts w:ascii="Consolas" w:cs="Consolas" w:eastAsia="Consolas" w:hAnsi="Consolas"/>
+                <w:color w:val="8B1D3B"/>
+                <w:sz w:val="22"/>
+                <w:szCs w:val="22"/>
+                <w:shd w:fill="EDF2F7" w:val="clear"/>
+              </w:rPr>
+              <w:t xml:space="preserve">v1.1.0</w:t>
+            </w:r>
+            <w:r>
+              <w:rPr>
+                <w:rFonts w:ascii="Calibri" w:cs="Calibri" w:eastAsia="Calibri" w:hAnsi="Calibri"/>
+                <w:color w:val="132238"/>
+                <w:sz w:val="24"/>
+                <w:szCs w:val="24"/>
+              </w:rPr>
+              <w:t xml:space="preserve"> tag; changelog and GitHub Release</w:t>
             </w:r>
           </w:p>
         </w:tc>
@@ -13347,7 +13686,7 @@
                 <w:sz w:val="24"/>
                 <w:szCs w:val="24"/>
               </w:rPr>
-              <w:t xml:space="preserve">Commit final changes, verify remote CI and record release notes</w:t>
+              <w:t xml:space="preserve">Verified release evidence, while production approval and stakeholder acceptance remain unavailable</w:t>
             </w:r>
           </w:p>
         </w:tc>
@@ -16240,7 +16579,7 @@
           <w:sz w:val="24"/>
           <w:szCs w:val="24"/>
         </w:rPr>
-        <w:t xml:space="preserve">The modular structure and dependency-free Node tests made domain rules easier to isolate, while multi-engine checks covered integration behaviour. However, browser-heavy branches remain less covered by the pure harness, final changes are not yet represented in a granular requirement-linked commit history, and expert evaluation cannot replace user observation. Representative testing would have improved confidence in terminology, recovery and interpretation, but access was unavailable. Recording this limitation is more professionally credible than inventing feedback.</w:t>
+        <w:t xml:space="preserve">The modular structure and dependency-free Node tests made domain rules easier to isolate, while multi-engine checks covered integration behaviour. However, browser-heavy branches remain less covered by the pure harness, the historical commit sequence is less granular than an ideal requirement-linked history, and expert evaluation cannot replace user observation. Representative testing would have improved confidence in terminology, recovery and interpretation, but access was unavailable. Recording this limitation is more professionally credible than inventing feedback.</w:t>
       </w:r>
     </w:p>
     <w:p>
@@ -16308,7 +16647,7 @@
         </w:rPr>
         <w:t xml:space="preserve">. Available at: </w:t>
       </w:r>
-      <w:hyperlink w:history="1" r:id="rIdr1g0ktsq9xdvhqc0vdgdh">
+      <w:hyperlink w:history="1" r:id="rIda_cbi7v4qfgaqatnrfae7">
         <w:r>
           <w:rPr>
             <w:rFonts w:ascii="Calibri" w:cs="Calibri" w:eastAsia="Calibri" w:hAnsi="Calibri"/>
@@ -16365,7 +16704,7 @@
         </w:rPr>
         <w:t xml:space="preserve">. MDN Web Docs. Available at: </w:t>
       </w:r>
-      <w:hyperlink w:history="1" r:id="rIdszw3-xhcnfws9imobdqne">
+      <w:hyperlink w:history="1" r:id="rId3ibqszdhx_mg32jznklnu">
         <w:r>
           <w:rPr>
             <w:rFonts w:ascii="Calibri" w:cs="Calibri" w:eastAsia="Calibri" w:hAnsi="Calibri"/>
@@ -16458,7 +16797,7 @@
         </w:rPr>
         <w:t xml:space="preserve">. Node.js documentation. Available at: </w:t>
       </w:r>
-      <w:hyperlink w:history="1" r:id="rIdrqhaze6lv4grom0vzqf33">
+      <w:hyperlink w:history="1" r:id="rIdcbciazkb9gsa3tu1de5vd">
         <w:r>
           <w:rPr>
             <w:rFonts w:ascii="Calibri" w:cs="Calibri" w:eastAsia="Calibri" w:hAnsi="Calibri"/>
@@ -16515,7 +16854,7 @@
         </w:rPr>
         <w:t xml:space="preserve">. Available at: </w:t>
       </w:r>
-      <w:hyperlink w:history="1" r:id="rId2qkzblgmiz_m4uvjfv3k_">
+      <w:hyperlink w:history="1" r:id="rIdme4votn_59loyawcm109a">
         <w:r>
           <w:rPr>
             <w:rFonts w:ascii="Calibri" w:cs="Calibri" w:eastAsia="Calibri" w:hAnsi="Calibri"/>
@@ -16572,7 +16911,7 @@
         </w:rPr>
         <w:t xml:space="preserve">. W3C Recommendation, 12 December. Available at: </w:t>
       </w:r>
-      <w:hyperlink w:history="1" r:id="rIdb75ytssk6b89s5jmvzntg">
+      <w:hyperlink w:history="1" r:id="rIdot0yppim16nuw0vb6agvz">
         <w:r>
           <w:rPr>
             <w:rFonts w:ascii="Calibri" w:cs="Calibri" w:eastAsia="Calibri" w:hAnsi="Calibri"/>

</xml_diff>